<commit_message>
Restore Visio figure design and align reviewer responses
</commit_message>
<xml_diff>
--- a/review/revision-1/Response-to-Reviewer-2.docx
+++ b/review/revision-1/Response-to-Reviewer-2.docx
@@ -893,7 +893,7 @@
                 <w:sz w:val="23"/>
                 <w:szCs w:val="23"/>
               </w:rPr>
-              <w:t xml:space="preserve">Response 2: We replaced the empty Figure 3 with a populated heatmap generated from 49 claim records covering 23 full-text mechanism studies. Rows identify object–assurance pairs and columns identify lifecycle stages. Each cell counts distinct studies supporting that exact association; the script does not construct unsupported combinations from separate labels. The lower panel reports overlapping L0–L5 evidence profiles.</w:t>
+              <w:t xml:space="preserve">Response 2: Figure 3 now combines the original OAL framework schematic in panel (a) with a populated heatmap in panel (b), generated from 49 claim records covering 23 full-text mechanism studies. Rows identify object–assurance pairs and columns identify lifecycle stages. Each cell counts distinct studies supporting that exact association; the script does not construct unsupported combinations from separate labels. The summary below the heatmap reports overlapping L0–L5 evidence profiles.</w:t>
             </w:r>
           </w:p>
         </w:tc>
@@ -2293,7 +2293,7 @@
                 <w:sz w:val="23"/>
                 <w:szCs w:val="23"/>
               </w:rPr>
-              <w:t xml:space="preserve">Response 8: The manuscript has been shortened from approximately 13,389 to 9,743 words using the same source-text counting procedure, a reduction of 27.2%. This estimate excludes the bibliography and is used consistently for the two versions. The core OAL vocabulary and appraisal/decision distinction are retained while repeated qualifications and overlapping explanations are consolidated.</w:t>
+              <w:t xml:space="preserve">Response 8: The manuscript has been shortened from approximately 13,389 to 9,771 words using the same source-text counting procedure, a reduction of 27.0%. This estimate excludes the bibliography and is used consistently for the two versions. The core OAL vocabulary and appraisal/decision distinction are retained while repeated qualifications and overlapping explanations are consolidated.</w:t>
             </w:r>
           </w:p>
         </w:tc>
@@ -2532,41 +2532,41 @@
                 <w:sz w:val="23"/>
                 <w:szCs w:val="23"/>
               </w:rPr>
-              <w:t xml:space="preserve">Response 9: All seven publication figures have been redrawn as vector PDFs with larger labels. Figure 2 now uses “Mission-use suitability”; Figure 4 uses “Causal hypotheses”, “Benign degradation” and “Both may coexist”. Figure 3 is the populated coverage heatmap, and Figure 7 is a schematic of complementary evidence forms.</w:t>
-            </w:r>
-          </w:p>
-        </w:tc>
-      </w:tr>
-      <w:tr>
-        <w:trPr>
-          <w:cantSplit/>
-        </w:trPr>
-        <w:tc>
-          <w:tcPr>
-            <w:tcW w:w="8834" w:type="dxa"/>
-            <w:gridSpan w:val="3"/>
-          </w:tcPr>
-          <w:p>
-            <w:pPr>
-              <w:rPr>
-                <w:rFonts w:ascii="Palatino Linotype" w:hAnsi="Palatino Linotype"/>
-                <w:i/>
-                <w:iCs/>
-                <w:color w:val="FF0000"/>
-              </w:rPr>
-              <w:pStyle w:val="Normal"/>
-              <w:spacing w:before="0" w:after="120" w:line="260" w:lineRule="auto"/>
-              <w:widowControl w:val="1"/>
-              <w:keepLines/>
-            </w:pPr>
-            <w:r>
-              <w:rPr>
-                <w:rFonts w:ascii="Palatino Linotype" w:hAnsi="Palatino Linotype"/>
-                <w:color w:val="FF0000"/>
-                <w:sz w:val="23"/>
-                <w:szCs w:val="23"/>
-              </w:rPr>
-              <w:t xml:space="preserve">The revised figures use only programmatic vector drawing and text. No photographic, stock or image-generation assets are used, and the generation script is supplied. This gives the revised Figure 7 an explicit, reproducible provenance. The figures and compiled pages have been visually checked for legibility.</w:t>
+              <w:t xml:space="preserve">Response 9: The original figures were prepared in Visio and exported to PDF with vector text and diagram geometry. We have revised the editable source to enlarge labels and improve spacing in Figures 1, 4, 5, and 6 while retaining their original visual structure, and checked the revised exports at their final size in the manuscript. Figure 2 now uses “Mission-use Suitability”; Figure 4 uses “Causal hypotheses”, “Benign degradation” and “Causes may coexist”. Figure 3 retains the OAL schematic alongside the populated coverage heatmap.</w:t>
+            </w:r>
+          </w:p>
+        </w:tc>
+      </w:tr>
+      <w:tr>
+        <w:trPr>
+          <w:cantSplit/>
+        </w:trPr>
+        <w:tc>
+          <w:tcPr>
+            <w:tcW w:w="8834" w:type="dxa"/>
+            <w:gridSpan w:val="3"/>
+          </w:tcPr>
+          <w:p>
+            <w:pPr>
+              <w:rPr>
+                <w:rFonts w:ascii="Palatino Linotype" w:hAnsi="Palatino Linotype"/>
+                <w:i/>
+                <w:iCs/>
+                <w:color w:val="FF0000"/>
+              </w:rPr>
+              <w:pStyle w:val="Normal"/>
+              <w:spacing w:before="0" w:after="120" w:line="260" w:lineRule="auto"/>
+              <w:widowControl w:val="1"/>
+              <w:keepLines/>
+            </w:pPr>
+            <w:r>
+              <w:rPr>
+                <w:rFonts w:ascii="Palatino Linotype" w:hAnsi="Palatino Linotype"/>
+                <w:color w:val="FF0000"/>
+                <w:sz w:val="23"/>
+                <w:szCs w:val="23"/>
+              </w:rPr>
+              <w:t xml:space="preserve">In Figure 7, the six photo-realistic illustrations have been replaced with schematic representations of the evidence forms. The six equal panels and category colors are retained. The new schematics consist of native Visio shapes and connectors; no photographic, stock or generated-image assets are used in this figure. The editable Visio source and PDF export script are supplied.</w:t>
             </w:r>
           </w:p>
         </w:tc>

</xml_diff>

<commit_message>
Refine manuscript layout, prose, and evidence schematic
</commit_message>
<xml_diff>
--- a/review/revision-1/Response-to-Reviewer-2.docx
+++ b/review/revision-1/Response-to-Reviewer-2.docx
@@ -2293,7 +2293,7 @@
                 <w:sz w:val="23"/>
                 <w:szCs w:val="23"/>
               </w:rPr>
-              <w:t xml:space="preserve">Response 8: The manuscript has been shortened from approximately 13,389 to 10,109 words using the same source-text counting procedure, a reduction of 24.5%. The estimate excludes the bibliography. The revision combines this reduction with the expanded full-text mapping, comparative synthesis and sensitivity analysis by consolidating repeated explanations and qualifications. The core OAL vocabulary and appraisal/decision distinction are retained.</w:t>
+              <w:t xml:space="preserve">Response 8: The manuscript has been shortened from approximately 13,389 to 9,936 words using the same source-text counting procedure, a reduction of 25.8%. The estimate excludes the bibliography. The revision combines this reduction with the expanded full-text mapping, comparative synthesis and sensitivity analysis by consolidating repeated explanations and qualifications. The core OAL vocabulary and appraisal/decision distinction are retained.</w:t>
             </w:r>
           </w:p>
         </w:tc>
@@ -2532,41 +2532,41 @@
                 <w:sz w:val="23"/>
                 <w:szCs w:val="23"/>
               </w:rPr>
-              <w:t xml:space="preserve">Response 9: The original figures were prepared in Visio and exported to PDF with vector text and diagram geometry. We have revised the editable source to enlarge labels and improve spacing in Figures 1, 4, 5, and 6 while retaining their original visual structure, and checked the revised exports at their final size in the manuscript. Figure 2 now uses “Mission-use Suitability”; Figure 4 uses “Causal hypotheses”, “Benign degradation” and “Causes may coexist”. Figure 3 retains the OAL schematic alongside the populated coverage heatmap.</w:t>
-            </w:r>
-          </w:p>
-        </w:tc>
-      </w:tr>
-      <w:tr>
-        <w:trPr>
-          <w:cantSplit/>
-        </w:trPr>
-        <w:tc>
-          <w:tcPr>
-            <w:tcW w:w="8834" w:type="dxa"/>
-            <w:gridSpan w:val="3"/>
-          </w:tcPr>
-          <w:p>
-            <w:pPr>
-              <w:rPr>
-                <w:rFonts w:ascii="Palatino Linotype" w:hAnsi="Palatino Linotype"/>
-                <w:i/>
-                <w:iCs/>
-                <w:color w:val="FF0000"/>
-              </w:rPr>
-              <w:pStyle w:val="Normal"/>
-              <w:spacing w:before="0" w:after="120" w:line="260" w:lineRule="auto"/>
-              <w:widowControl w:val="1"/>
-              <w:keepLines/>
-            </w:pPr>
-            <w:r>
-              <w:rPr>
-                <w:rFonts w:ascii="Palatino Linotype" w:hAnsi="Palatino Linotype"/>
-                <w:color w:val="FF0000"/>
-                <w:sz w:val="23"/>
-                <w:szCs w:val="23"/>
-              </w:rPr>
-              <w:t xml:space="preserve">In Figure 7, the six photo-realistic illustrations have been replaced with schematic representations of the evidence forms. The six equal panels and category colors are retained. The new schematics consist of native Visio shapes and connectors; no photographic, stock or generated-image assets are used in this figure. The editable Visio source and PDF export script are supplied.</w:t>
+              <w:t xml:space="preserve">Response 9: The original figures were prepared in Visio and exported to PDF with vector text and diagram geometry. We have revised the editable source to enlarge labels and improve spacing in Figures 1, 4, 5, and 6 while retaining their original visual structure, and checked the revised exports at their final size in the manuscript. Figure 2 now uses “Mission-use Suitability”; Figure 4 uses “Causal hypotheses”, “Benign degradation” and “Causes may coexist”. Figure 3 retains the OAL schematic alongside the populated coverage heatmap. Figure 5 is placed with the CTG discussion on a text page.</w:t>
+            </w:r>
+          </w:p>
+        </w:tc>
+      </w:tr>
+      <w:tr>
+        <w:trPr>
+          <w:cantSplit/>
+        </w:trPr>
+        <w:tc>
+          <w:tcPr>
+            <w:tcW w:w="8834" w:type="dxa"/>
+            <w:gridSpan w:val="3"/>
+          </w:tcPr>
+          <w:p>
+            <w:pPr>
+              <w:rPr>
+                <w:rFonts w:ascii="Palatino Linotype" w:hAnsi="Palatino Linotype"/>
+                <w:i/>
+                <w:iCs/>
+                <w:color w:val="FF0000"/>
+              </w:rPr>
+              <w:pStyle w:val="Normal"/>
+              <w:spacing w:before="0" w:after="120" w:line="260" w:lineRule="auto"/>
+              <w:widowControl w:val="1"/>
+              <w:keepLines/>
+            </w:pPr>
+            <w:r>
+              <w:rPr>
+                <w:rFonts w:ascii="Palatino Linotype" w:hAnsi="Palatino Linotype"/>
+                <w:color w:val="FF0000"/>
+                <w:sz w:val="23"/>
+                <w:szCs w:val="23"/>
+              </w:rPr>
+              <w:t xml:space="preserve">In Figure 7, the six photo-realistic illustrations have been replaced with text-and-box diagrams showing the inputs, reasoning or evaluation, and outputs associated with each evidence form. The six equal panels and category colors are retained. All diagram elements are native Visio text boxes and connecting arrows; no photographic, stock or generated-image assets are used. The editable Visio source, diagram-building script and PDF export script are supplied.</w:t>
             </w:r>
           </w:p>
         </w:tc>

</xml_diff>